<commit_message>
docs: align student IDs right and restore full-page contents styling
</commit_message>
<xml_diff>
--- a/docs/bao-cao-tri-tue-nhan-tao-nhom-6-hoan-thien.docx
+++ b/docs/bao-cao-tri-tue-nhan-tao-nhom-6-hoan-thien.docx
@@ -614,14 +614,15 @@
     </w:p>
     <w:p>
       <w:pPr>
+        <w:spacing w:after="120" w:line="240" w:lineRule="auto"/>
+        <w:ind w:left="850" w:right="283"/>
+        <w:jc w:val="left"/>
+        <w:rPr>
+          <w:b/>
+        </w:rPr>
         <w:tabs>
-          <w:tab w:pos="6123" w:val="left"/>
+          <w:tab w:val="right" w:pos="8787"/>
         </w:tabs>
-        <w:spacing w:after="120" w:line="240" w:lineRule="auto"/>
-        <w:ind w:left="850"/>
-        <w:rPr>
-          <w:b/>
-        </w:rPr>
       </w:pPr>
       <w:r>
         <w:rPr>
@@ -739,14 +740,15 @@
     </w:p>
     <w:p>
       <w:pPr>
+        <w:spacing w:after="120" w:line="240" w:lineRule="auto"/>
+        <w:ind w:left="850" w:right="283"/>
+        <w:jc w:val="left"/>
+        <w:rPr>
+          <w:b/>
+        </w:rPr>
         <w:tabs>
-          <w:tab w:pos="6123" w:val="left"/>
+          <w:tab w:val="right" w:pos="8787"/>
         </w:tabs>
-        <w:spacing w:after="120" w:line="240" w:lineRule="auto"/>
-        <w:ind w:left="850"/>
-        <w:rPr>
-          <w:b/>
-        </w:rPr>
       </w:pPr>
       <w:proofErr w:type="spellStart"/>
       <w:r>
@@ -863,14 +865,15 @@
     </w:p>
     <w:p>
       <w:pPr>
+        <w:spacing w:after="120" w:line="240" w:lineRule="auto"/>
+        <w:ind w:left="850" w:right="283"/>
+        <w:jc w:val="left"/>
+        <w:rPr>
+          <w:lang w:val="vi-VN"/>
+        </w:rPr>
         <w:tabs>
-          <w:tab w:pos="6123" w:val="left"/>
+          <w:tab w:val="right" w:pos="8787"/>
         </w:tabs>
-        <w:spacing w:after="120" w:line="240" w:lineRule="auto"/>
-        <w:ind w:left="850"/>
-        <w:rPr>
-          <w:lang w:val="vi-VN"/>
-        </w:rPr>
       </w:pPr>
       <w:proofErr w:type="spellStart"/>
       <w:r>
@@ -1274,16 +1277,16 @@
           </w:tcPr>
           <w:p>
             <w:pPr>
-              <w:spacing w:line="360" w:lineRule="exact" w:after="180"/>
+              <w:spacing w:line="400" w:lineRule="exact" w:after="180"/>
               <w:ind w:left="0" w:right="0" w:firstLine="0"/>
               <w:jc w:val="left"/>
             </w:pPr>
             <w:r>
               <w:rPr>
                 <w:b/>
-                <w:sz w:val="24"/>
+                <w:sz w:val="26"/>
               </w:rPr>
-              <w:t>LỜI MỞ ĐẦU ...................................................................................................................</w:t>
+              <w:t>LỜI MỞ ĐẦU .........................................................................................................</w:t>
             </w:r>
           </w:p>
         </w:tc>
@@ -1299,14 +1302,14 @@
           </w:tcPr>
           <w:p>
             <w:pPr>
-              <w:spacing w:line="360" w:lineRule="exact" w:after="180"/>
+              <w:spacing w:line="400" w:lineRule="exact" w:after="180"/>
               <w:ind w:left="0" w:right="0" w:firstLine="0"/>
               <w:jc w:val="right"/>
             </w:pPr>
             <w:r>
               <w:rPr>
                 <w:b/>
-                <w:sz w:val="24"/>
+                <w:sz w:val="26"/>
               </w:rPr>
               <w:t>3</w:t>
             </w:r>
@@ -1326,16 +1329,16 @@
           </w:tcPr>
           <w:p>
             <w:pPr>
-              <w:spacing w:line="360" w:lineRule="exact" w:after="180"/>
+              <w:spacing w:line="400" w:lineRule="exact" w:after="180"/>
               <w:ind w:left="0" w:right="0" w:firstLine="0"/>
               <w:jc w:val="left"/>
             </w:pPr>
             <w:r>
               <w:rPr>
                 <w:b/>
-                <w:sz w:val="24"/>
+                <w:sz w:val="26"/>
               </w:rPr>
-              <w:t>CHƯƠNG 1 TỔNG QUAN VỀ PHÂN LOẠI VĂN BẢN ............................................</w:t>
+              <w:t>CHƯƠNG 1 TỔNG QUAN VỀ PHÂN LOẠI VĂN BẢN ..................................</w:t>
             </w:r>
           </w:p>
         </w:tc>
@@ -1351,14 +1354,14 @@
           </w:tcPr>
           <w:p>
             <w:pPr>
-              <w:spacing w:line="360" w:lineRule="exact" w:after="180"/>
+              <w:spacing w:line="400" w:lineRule="exact" w:after="180"/>
               <w:ind w:left="0" w:right="0" w:firstLine="0"/>
               <w:jc w:val="right"/>
             </w:pPr>
             <w:r>
               <w:rPr>
                 <w:b/>
-                <w:sz w:val="24"/>
+                <w:sz w:val="26"/>
               </w:rPr>
               <w:t>4</w:t>
             </w:r>
@@ -1378,16 +1381,16 @@
           </w:tcPr>
           <w:p>
             <w:pPr>
-              <w:spacing w:line="360" w:lineRule="exact" w:after="180"/>
+              <w:spacing w:line="400" w:lineRule="exact" w:after="180"/>
               <w:ind w:left="0" w:right="0" w:firstLine="0"/>
               <w:jc w:val="left"/>
             </w:pPr>
             <w:r>
               <w:rPr>
                 <w:b/>
-                <w:sz w:val="24"/>
+                <w:sz w:val="26"/>
               </w:rPr>
-              <w:t>CHƯƠNG 2 TIỀN XỬ LÝ VÀ BIỂU DIỄN VĂN BẢN ...............................................</w:t>
+              <w:t>CHƯƠNG 2 TIỀN XỬ LÝ VÀ BIỂU DIỄN VĂN BẢN ....................................</w:t>
             </w:r>
           </w:p>
         </w:tc>
@@ -1403,14 +1406,14 @@
           </w:tcPr>
           <w:p>
             <w:pPr>
-              <w:spacing w:line="360" w:lineRule="exact" w:after="180"/>
+              <w:spacing w:line="400" w:lineRule="exact" w:after="180"/>
               <w:ind w:left="0" w:right="0" w:firstLine="0"/>
               <w:jc w:val="right"/>
             </w:pPr>
             <w:r>
               <w:rPr>
                 <w:b/>
-                <w:sz w:val="24"/>
+                <w:sz w:val="26"/>
               </w:rPr>
               <w:t>5</w:t>
             </w:r>
@@ -1430,16 +1433,16 @@
           </w:tcPr>
           <w:p>
             <w:pPr>
-              <w:spacing w:line="360" w:lineRule="exact" w:after="180"/>
-              <w:ind w:left="0" w:right="0" w:firstLine="0"/>
+              <w:spacing w:line="400" w:lineRule="exact" w:after="180"/>
+              <w:ind w:left="255" w:right="0" w:firstLine="0"/>
               <w:jc w:val="left"/>
             </w:pPr>
             <w:r>
               <w:rPr>
                 <w:b w:val="0"/>
-                <w:sz w:val="24"/>
+                <w:sz w:val="26"/>
               </w:rPr>
-              <w:t>2.2 Bag of Words và TF IDF ..............................................................................................</w:t>
+              <w:t>2.2 Bag of Words và TF IDF ...............................................................................</w:t>
             </w:r>
           </w:p>
         </w:tc>
@@ -1455,14 +1458,14 @@
           </w:tcPr>
           <w:p>
             <w:pPr>
-              <w:spacing w:line="360" w:lineRule="exact" w:after="180"/>
+              <w:spacing w:line="400" w:lineRule="exact" w:after="180"/>
               <w:ind w:left="0" w:right="0" w:firstLine="0"/>
               <w:jc w:val="right"/>
             </w:pPr>
             <w:r>
               <w:rPr>
                 <w:b w:val="0"/>
-                <w:sz w:val="24"/>
+                <w:sz w:val="26"/>
               </w:rPr>
               <w:t>6</w:t>
             </w:r>
@@ -1482,16 +1485,16 @@
           </w:tcPr>
           <w:p>
             <w:pPr>
-              <w:spacing w:line="360" w:lineRule="exact" w:after="180"/>
+              <w:spacing w:line="400" w:lineRule="exact" w:after="180"/>
               <w:ind w:left="0" w:right="0" w:firstLine="0"/>
               <w:jc w:val="left"/>
             </w:pPr>
             <w:r>
               <w:rPr>
                 <w:b/>
-                <w:sz w:val="24"/>
+                <w:sz w:val="26"/>
               </w:rPr>
-              <w:t>CHƯƠNG 3 CƠ SỞ LÝ THUYẾT CỦA NAIVE BAYES ...........................................</w:t>
+              <w:t>CHƯƠNG 3 CƠ SỞ LÝ THUYẾT CỦA NAIVE BAYES .................................</w:t>
             </w:r>
           </w:p>
         </w:tc>
@@ -1507,14 +1510,14 @@
           </w:tcPr>
           <w:p>
             <w:pPr>
-              <w:spacing w:line="360" w:lineRule="exact" w:after="180"/>
+              <w:spacing w:line="400" w:lineRule="exact" w:after="180"/>
               <w:ind w:left="0" w:right="0" w:firstLine="0"/>
               <w:jc w:val="right"/>
             </w:pPr>
             <w:r>
               <w:rPr>
                 <w:b/>
-                <w:sz w:val="24"/>
+                <w:sz w:val="26"/>
               </w:rPr>
               <w:t>7</w:t>
             </w:r>
@@ -1534,16 +1537,16 @@
           </w:tcPr>
           <w:p>
             <w:pPr>
-              <w:spacing w:line="360" w:lineRule="exact" w:after="180"/>
-              <w:ind w:left="0" w:right="0" w:firstLine="0"/>
+              <w:spacing w:line="400" w:lineRule="exact" w:after="180"/>
+              <w:ind w:left="255" w:right="0" w:firstLine="0"/>
               <w:jc w:val="left"/>
             </w:pPr>
             <w:r>
               <w:rPr>
                 <w:b w:val="0"/>
-                <w:sz w:val="24"/>
+                <w:sz w:val="26"/>
               </w:rPr>
-              <w:t>3.2 Mô hình Multinomial Naive Bayes ..............................................................................</w:t>
+              <w:t>3.2 Mô hình Multinomial Naive Bayes ................................................................</w:t>
             </w:r>
           </w:p>
         </w:tc>
@@ -1559,14 +1562,14 @@
           </w:tcPr>
           <w:p>
             <w:pPr>
-              <w:spacing w:line="360" w:lineRule="exact" w:after="180"/>
+              <w:spacing w:line="400" w:lineRule="exact" w:after="180"/>
               <w:ind w:left="0" w:right="0" w:firstLine="0"/>
               <w:jc w:val="right"/>
             </w:pPr>
             <w:r>
               <w:rPr>
                 <w:b w:val="0"/>
-                <w:sz w:val="24"/>
+                <w:sz w:val="26"/>
               </w:rPr>
               <w:t>8</w:t>
             </w:r>
@@ -1586,16 +1589,16 @@
           </w:tcPr>
           <w:p>
             <w:pPr>
-              <w:spacing w:line="360" w:lineRule="exact" w:after="180"/>
+              <w:spacing w:line="400" w:lineRule="exact" w:after="180"/>
               <w:ind w:left="0" w:right="0" w:firstLine="0"/>
               <w:jc w:val="left"/>
             </w:pPr>
             <w:r>
               <w:rPr>
                 <w:b/>
-                <w:sz w:val="24"/>
+                <w:sz w:val="26"/>
               </w:rPr>
-              <w:t>CHƯƠNG 4 QUY TRÌNH HỌC VÀ DỰ ĐOÁN ..........................................................</w:t>
+              <w:t>CHƯƠNG 4 QUY TRÌNH HỌC VÀ DỰ ĐOÁN ................................................</w:t>
             </w:r>
           </w:p>
         </w:tc>
@@ -1611,14 +1614,14 @@
           </w:tcPr>
           <w:p>
             <w:pPr>
-              <w:spacing w:line="360" w:lineRule="exact" w:after="180"/>
+              <w:spacing w:line="400" w:lineRule="exact" w:after="180"/>
               <w:ind w:left="0" w:right="0" w:firstLine="0"/>
               <w:jc w:val="right"/>
             </w:pPr>
             <w:r>
               <w:rPr>
                 <w:b/>
-                <w:sz w:val="24"/>
+                <w:sz w:val="26"/>
               </w:rPr>
               <w:t>9</w:t>
             </w:r>
@@ -1638,16 +1641,16 @@
           </w:tcPr>
           <w:p>
             <w:pPr>
-              <w:spacing w:line="360" w:lineRule="exact" w:after="180"/>
+              <w:spacing w:line="400" w:lineRule="exact" w:after="180"/>
               <w:ind w:left="0" w:right="0" w:firstLine="0"/>
               <w:jc w:val="left"/>
             </w:pPr>
             <w:r>
               <w:rPr>
                 <w:b/>
-                <w:sz w:val="24"/>
+                <w:sz w:val="26"/>
               </w:rPr>
-              <w:t>CHƯƠNG 5 VÍ DỤ MINH HỌA TÍNH TAY ................................................................</w:t>
+              <w:t>CHƯƠNG 5 VÍ DỤ MINH HỌA TÍNH TAY .....................................................</w:t>
             </w:r>
           </w:p>
         </w:tc>
@@ -1663,14 +1666,14 @@
           </w:tcPr>
           <w:p>
             <w:pPr>
-              <w:spacing w:line="360" w:lineRule="exact" w:after="180"/>
+              <w:spacing w:line="400" w:lineRule="exact" w:after="180"/>
               <w:ind w:left="0" w:right="0" w:firstLine="0"/>
               <w:jc w:val="right"/>
             </w:pPr>
             <w:r>
               <w:rPr>
                 <w:b/>
-                <w:sz w:val="24"/>
+                <w:sz w:val="26"/>
               </w:rPr>
               <w:t>10</w:t>
             </w:r>
@@ -1690,16 +1693,16 @@
           </w:tcPr>
           <w:p>
             <w:pPr>
-              <w:spacing w:line="360" w:lineRule="exact" w:after="180"/>
-              <w:ind w:left="0" w:right="0" w:firstLine="0"/>
+              <w:spacing w:line="400" w:lineRule="exact" w:after="180"/>
+              <w:ind w:left="255" w:right="0" w:firstLine="0"/>
               <w:jc w:val="left"/>
             </w:pPr>
             <w:r>
               <w:rPr>
                 <w:b w:val="0"/>
-                <w:sz w:val="24"/>
+                <w:sz w:val="26"/>
               </w:rPr>
-              <w:t>5.2 Tính điểm và giải thích dự đoán ...................................................................................</w:t>
+              <w:t>5.2 Tính điểm và giải thích dự đoán .....................................................................</w:t>
             </w:r>
           </w:p>
         </w:tc>
@@ -1715,14 +1718,14 @@
           </w:tcPr>
           <w:p>
             <w:pPr>
-              <w:spacing w:line="360" w:lineRule="exact" w:after="180"/>
+              <w:spacing w:line="400" w:lineRule="exact" w:after="180"/>
               <w:ind w:left="0" w:right="0" w:firstLine="0"/>
               <w:jc w:val="right"/>
             </w:pPr>
             <w:r>
               <w:rPr>
                 <w:b w:val="0"/>
-                <w:sz w:val="24"/>
+                <w:sz w:val="26"/>
               </w:rPr>
               <w:t>11</w:t>
             </w:r>
@@ -1742,16 +1745,16 @@
           </w:tcPr>
           <w:p>
             <w:pPr>
-              <w:spacing w:line="360" w:lineRule="exact" w:after="180"/>
+              <w:spacing w:line="400" w:lineRule="exact" w:after="180"/>
               <w:ind w:left="0" w:right="0" w:firstLine="0"/>
               <w:jc w:val="left"/>
             </w:pPr>
             <w:r>
               <w:rPr>
                 <w:b/>
-                <w:sz w:val="24"/>
+                <w:sz w:val="26"/>
               </w:rPr>
-              <w:t>CHƯƠNG 6 ĐÁNH GIÁ PHƯƠNG PHÁP PHÂN LOẠI ...........................................</w:t>
+              <w:t>CHƯƠNG 6 ĐÁNH GIÁ PHƯƠNG PHÁP PHÂN LOẠI .................................</w:t>
             </w:r>
           </w:p>
         </w:tc>
@@ -1767,14 +1770,14 @@
           </w:tcPr>
           <w:p>
             <w:pPr>
-              <w:spacing w:line="360" w:lineRule="exact" w:after="180"/>
+              <w:spacing w:line="400" w:lineRule="exact" w:after="180"/>
               <w:ind w:left="0" w:right="0" w:firstLine="0"/>
               <w:jc w:val="right"/>
             </w:pPr>
             <w:r>
               <w:rPr>
                 <w:b/>
-                <w:sz w:val="24"/>
+                <w:sz w:val="26"/>
               </w:rPr>
               <w:t>12</w:t>
             </w:r>
@@ -1794,16 +1797,16 @@
           </w:tcPr>
           <w:p>
             <w:pPr>
-              <w:spacing w:line="360" w:lineRule="exact" w:after="180"/>
+              <w:spacing w:line="400" w:lineRule="exact" w:after="180"/>
               <w:ind w:left="0" w:right="0" w:firstLine="0"/>
               <w:jc w:val="left"/>
             </w:pPr>
             <w:r>
               <w:rPr>
                 <w:b/>
-                <w:sz w:val="24"/>
+                <w:sz w:val="26"/>
               </w:rPr>
-              <w:t>CHƯƠNG 7 NHẬN XÉT VÀ HƯỚNG MỞ RỘNG .....................................................</w:t>
+              <w:t>CHƯƠNG 7 NHẬN XÉT VÀ HƯỚNG MỞ RỘNG ..........................................</w:t>
             </w:r>
           </w:p>
         </w:tc>
@@ -1819,14 +1822,14 @@
           </w:tcPr>
           <w:p>
             <w:pPr>
-              <w:spacing w:line="360" w:lineRule="exact" w:after="180"/>
+              <w:spacing w:line="400" w:lineRule="exact" w:after="180"/>
               <w:ind w:left="0" w:right="0" w:firstLine="0"/>
               <w:jc w:val="right"/>
             </w:pPr>
             <w:r>
               <w:rPr>
                 <w:b/>
-                <w:sz w:val="24"/>
+                <w:sz w:val="26"/>
               </w:rPr>
               <w:t>13</w:t>
             </w:r>
@@ -1846,16 +1849,16 @@
           </w:tcPr>
           <w:p>
             <w:pPr>
-              <w:spacing w:line="360" w:lineRule="exact" w:after="180"/>
-              <w:ind w:left="0" w:right="0" w:firstLine="0"/>
+              <w:spacing w:line="400" w:lineRule="exact" w:after="180"/>
+              <w:ind w:left="255" w:right="0" w:firstLine="0"/>
               <w:jc w:val="left"/>
             </w:pPr>
             <w:r>
               <w:rPr>
                 <w:b w:val="0"/>
-                <w:sz w:val="24"/>
+                <w:sz w:val="26"/>
               </w:rPr>
-              <w:t>7.2 Ứng dụng và hướng phát triển ......................................................................................</w:t>
+              <w:t>7.2 Ứng dụng và hướng phát triển .......................................................................</w:t>
             </w:r>
           </w:p>
         </w:tc>
@@ -1871,14 +1874,14 @@
           </w:tcPr>
           <w:p>
             <w:pPr>
-              <w:spacing w:line="360" w:lineRule="exact" w:after="180"/>
+              <w:spacing w:line="400" w:lineRule="exact" w:after="180"/>
               <w:ind w:left="0" w:right="0" w:firstLine="0"/>
               <w:jc w:val="right"/>
             </w:pPr>
             <w:r>
               <w:rPr>
                 <w:b w:val="0"/>
-                <w:sz w:val="24"/>
+                <w:sz w:val="26"/>
               </w:rPr>
               <w:t>14</w:t>
             </w:r>
@@ -1898,16 +1901,16 @@
           </w:tcPr>
           <w:p>
             <w:pPr>
-              <w:spacing w:line="360" w:lineRule="exact" w:after="180"/>
+              <w:spacing w:line="400" w:lineRule="exact" w:after="180"/>
               <w:ind w:left="0" w:right="0" w:firstLine="0"/>
               <w:jc w:val="left"/>
             </w:pPr>
             <w:r>
               <w:rPr>
                 <w:b/>
-                <w:sz w:val="24"/>
+                <w:sz w:val="26"/>
               </w:rPr>
-              <w:t>CHƯƠNG 8 Ý TƯỞNG VÀ CHỨC NĂNG HỆ THỐNG ............................................</w:t>
+              <w:t>CHƯƠNG 8 Ý TƯỞNG VÀ CHỨC NĂNG HỆ THỐNG .................................</w:t>
             </w:r>
           </w:p>
         </w:tc>
@@ -1923,14 +1926,14 @@
           </w:tcPr>
           <w:p>
             <w:pPr>
-              <w:spacing w:line="360" w:lineRule="exact" w:after="180"/>
+              <w:spacing w:line="400" w:lineRule="exact" w:after="180"/>
               <w:ind w:left="0" w:right="0" w:firstLine="0"/>
               <w:jc w:val="right"/>
             </w:pPr>
             <w:r>
               <w:rPr>
                 <w:b/>
-                <w:sz w:val="24"/>
+                <w:sz w:val="26"/>
               </w:rPr>
               <w:t>15</w:t>
             </w:r>
@@ -1950,16 +1953,16 @@
           </w:tcPr>
           <w:p>
             <w:pPr>
-              <w:spacing w:line="360" w:lineRule="exact" w:after="180"/>
-              <w:ind w:left="0" w:right="0" w:firstLine="0"/>
+              <w:spacing w:line="400" w:lineRule="exact" w:after="180"/>
+              <w:ind w:left="255" w:right="0" w:firstLine="0"/>
               <w:jc w:val="left"/>
             </w:pPr>
             <w:r>
               <w:rPr>
                 <w:b w:val="0"/>
-                <w:sz w:val="24"/>
+                <w:sz w:val="26"/>
               </w:rPr>
-              <w:t>8.3 Yêu cầu và các tình huống sử dụng ..............................................................................</w:t>
+              <w:t>8.3 Yêu cầu và các tình huống sử dụng ................................................................</w:t>
             </w:r>
           </w:p>
         </w:tc>
@@ -1975,14 +1978,14 @@
           </w:tcPr>
           <w:p>
             <w:pPr>
-              <w:spacing w:line="360" w:lineRule="exact" w:after="180"/>
+              <w:spacing w:line="400" w:lineRule="exact" w:after="180"/>
               <w:ind w:left="0" w:right="0" w:firstLine="0"/>
               <w:jc w:val="right"/>
             </w:pPr>
             <w:r>
               <w:rPr>
                 <w:b w:val="0"/>
-                <w:sz w:val="24"/>
+                <w:sz w:val="26"/>
               </w:rPr>
               <w:t>16</w:t>
             </w:r>
@@ -2002,16 +2005,16 @@
           </w:tcPr>
           <w:p>
             <w:pPr>
-              <w:spacing w:line="360" w:lineRule="exact" w:after="180"/>
+              <w:spacing w:line="400" w:lineRule="exact" w:after="180"/>
               <w:ind w:left="0" w:right="0" w:firstLine="0"/>
               <w:jc w:val="left"/>
             </w:pPr>
             <w:r>
               <w:rPr>
                 <w:b/>
-                <w:sz w:val="24"/>
+                <w:sz w:val="26"/>
               </w:rPr>
-              <w:t>CHƯƠNG 9 DỮ LIỆU VÀ LOGIC XỬ LÝ ..................................................................</w:t>
+              <w:t>CHƯƠNG 9 DỮ LIỆU VÀ LOGIC XỬ LÝ ........................................................</w:t>
             </w:r>
           </w:p>
         </w:tc>
@@ -2027,14 +2030,14 @@
           </w:tcPr>
           <w:p>
             <w:pPr>
-              <w:spacing w:line="360" w:lineRule="exact" w:after="180"/>
+              <w:spacing w:line="400" w:lineRule="exact" w:after="180"/>
               <w:ind w:left="0" w:right="0" w:firstLine="0"/>
               <w:jc w:val="right"/>
             </w:pPr>
             <w:r>
               <w:rPr>
                 <w:b/>
-                <w:sz w:val="24"/>
+                <w:sz w:val="26"/>
               </w:rPr>
               <w:t>17</w:t>
             </w:r>
@@ -2054,16 +2057,16 @@
           </w:tcPr>
           <w:p>
             <w:pPr>
-              <w:spacing w:line="360" w:lineRule="exact" w:after="180"/>
-              <w:ind w:left="0" w:right="0" w:firstLine="0"/>
+              <w:spacing w:line="400" w:lineRule="exact" w:after="180"/>
+              <w:ind w:left="255" w:right="0" w:firstLine="0"/>
               <w:jc w:val="left"/>
             </w:pPr>
             <w:r>
               <w:rPr>
                 <w:b w:val="0"/>
-                <w:sz w:val="24"/>
+                <w:sz w:val="26"/>
               </w:rPr>
-              <w:t>9.3 Huấn luyện và lựa chọn mô hình ..................................................................................</w:t>
+              <w:t>9.3 Huấn luyện và lựa chọn mô hình ...................................................................</w:t>
             </w:r>
           </w:p>
         </w:tc>
@@ -2079,14 +2082,14 @@
           </w:tcPr>
           <w:p>
             <w:pPr>
-              <w:spacing w:line="360" w:lineRule="exact" w:after="180"/>
+              <w:spacing w:line="400" w:lineRule="exact" w:after="180"/>
               <w:ind w:left="0" w:right="0" w:firstLine="0"/>
               <w:jc w:val="right"/>
             </w:pPr>
             <w:r>
               <w:rPr>
                 <w:b w:val="0"/>
-                <w:sz w:val="24"/>
+                <w:sz w:val="26"/>
               </w:rPr>
               <w:t>18</w:t>
             </w:r>
@@ -2106,16 +2109,16 @@
           </w:tcPr>
           <w:p>
             <w:pPr>
-              <w:spacing w:line="360" w:lineRule="exact" w:after="180"/>
+              <w:spacing w:line="400" w:lineRule="exact" w:after="180"/>
               <w:ind w:left="0" w:right="0" w:firstLine="0"/>
               <w:jc w:val="left"/>
             </w:pPr>
             <w:r>
               <w:rPr>
                 <w:b/>
-                <w:sz w:val="24"/>
+                <w:sz w:val="26"/>
               </w:rPr>
-              <w:t>CHƯƠNG 10 MÔ TẢ GIAO DIỆN VÀ KẾT QUẢ ......................................................</w:t>
+              <w:t>CHƯƠNG 10 MÔ TẢ GIAO DIỆN VÀ KẾT QUẢ ...........................................</w:t>
             </w:r>
           </w:p>
         </w:tc>
@@ -2131,14 +2134,14 @@
           </w:tcPr>
           <w:p>
             <w:pPr>
-              <w:spacing w:line="360" w:lineRule="exact" w:after="180"/>
+              <w:spacing w:line="400" w:lineRule="exact" w:after="180"/>
               <w:ind w:left="0" w:right="0" w:firstLine="0"/>
               <w:jc w:val="right"/>
             </w:pPr>
             <w:r>
               <w:rPr>
                 <w:b/>
-                <w:sz w:val="24"/>
+                <w:sz w:val="26"/>
               </w:rPr>
               <w:t>19</w:t>
             </w:r>
@@ -2158,16 +2161,16 @@
           </w:tcPr>
           <w:p>
             <w:pPr>
-              <w:spacing w:line="360" w:lineRule="exact" w:after="180"/>
-              <w:ind w:left="0" w:right="0" w:firstLine="0"/>
+              <w:spacing w:line="400" w:lineRule="exact" w:after="180"/>
+              <w:ind w:left="255" w:right="0" w:firstLine="0"/>
               <w:jc w:val="left"/>
             </w:pPr>
             <w:r>
               <w:rPr>
                 <w:b w:val="0"/>
-                <w:sz w:val="24"/>
+                <w:sz w:val="26"/>
               </w:rPr>
-              <w:t>10.3 Giải thích và lịch sử dự đoán ......................................................................................</w:t>
+              <w:t>10.3 Giải thích và lịch sử dự đoán .......................................................................</w:t>
             </w:r>
           </w:p>
         </w:tc>
@@ -2183,14 +2186,14 @@
           </w:tcPr>
           <w:p>
             <w:pPr>
-              <w:spacing w:line="360" w:lineRule="exact" w:after="180"/>
+              <w:spacing w:line="400" w:lineRule="exact" w:after="180"/>
               <w:ind w:left="0" w:right="0" w:firstLine="0"/>
               <w:jc w:val="right"/>
             </w:pPr>
             <w:r>
               <w:rPr>
                 <w:b w:val="0"/>
-                <w:sz w:val="24"/>
+                <w:sz w:val="26"/>
               </w:rPr>
               <w:t>20</w:t>
             </w:r>
@@ -2210,16 +2213,16 @@
           </w:tcPr>
           <w:p>
             <w:pPr>
-              <w:spacing w:line="360" w:lineRule="exact" w:after="180"/>
+              <w:spacing w:line="400" w:lineRule="exact" w:after="180"/>
               <w:ind w:left="0" w:right="0" w:firstLine="0"/>
               <w:jc w:val="left"/>
             </w:pPr>
             <w:r>
               <w:rPr>
                 <w:b/>
-                <w:sz w:val="24"/>
+                <w:sz w:val="26"/>
               </w:rPr>
-              <w:t>CHƯƠNG 11 THƯ VIỆN VÀ ĐỊNH HƯỚNG ĐÁNH GIÁ ........................................</w:t>
+              <w:t>CHƯƠNG 11 THƯ VIỆN VÀ ĐỊNH HƯỚNG ĐÁNH GIÁ .............................</w:t>
             </w:r>
           </w:p>
         </w:tc>
@@ -2235,14 +2238,14 @@
           </w:tcPr>
           <w:p>
             <w:pPr>
-              <w:spacing w:line="360" w:lineRule="exact" w:after="180"/>
+              <w:spacing w:line="400" w:lineRule="exact" w:after="180"/>
               <w:ind w:left="0" w:right="0" w:firstLine="0"/>
               <w:jc w:val="right"/>
             </w:pPr>
             <w:r>
               <w:rPr>
                 <w:b/>
-                <w:sz w:val="24"/>
+                <w:sz w:val="26"/>
               </w:rPr>
               <w:t>21</w:t>
             </w:r>
@@ -2262,16 +2265,16 @@
           </w:tcPr>
           <w:p>
             <w:pPr>
-              <w:spacing w:line="360" w:lineRule="exact" w:after="180"/>
-              <w:ind w:left="0" w:right="0" w:firstLine="0"/>
+              <w:spacing w:line="400" w:lineRule="exact" w:after="180"/>
+              <w:ind w:left="255" w:right="0" w:firstLine="0"/>
               <w:jc w:val="left"/>
             </w:pPr>
             <w:r>
               <w:rPr>
                 <w:b w:val="0"/>
-                <w:sz w:val="24"/>
+                <w:sz w:val="26"/>
               </w:rPr>
-              <w:t>11.3 Đánh giá và giới hạn triển khai ...................................................................................</w:t>
+              <w:t>11.3 Đánh giá và giới hạn triển khai ....................................................................</w:t>
             </w:r>
           </w:p>
         </w:tc>
@@ -2287,14 +2290,14 @@
           </w:tcPr>
           <w:p>
             <w:pPr>
-              <w:spacing w:line="360" w:lineRule="exact" w:after="180"/>
+              <w:spacing w:line="400" w:lineRule="exact" w:after="180"/>
               <w:ind w:left="0" w:right="0" w:firstLine="0"/>
               <w:jc w:val="right"/>
             </w:pPr>
             <w:r>
               <w:rPr>
                 <w:b w:val="0"/>
-                <w:sz w:val="24"/>
+                <w:sz w:val="26"/>
               </w:rPr>
               <w:t>22</w:t>
             </w:r>
@@ -2314,16 +2317,16 @@
           </w:tcPr>
           <w:p>
             <w:pPr>
-              <w:spacing w:line="360" w:lineRule="exact" w:after="180"/>
+              <w:spacing w:line="400" w:lineRule="exact" w:after="180"/>
               <w:ind w:left="0" w:right="0" w:firstLine="0"/>
               <w:jc w:val="left"/>
             </w:pPr>
             <w:r>
               <w:rPr>
                 <w:b/>
-                <w:sz w:val="24"/>
+                <w:sz w:val="26"/>
               </w:rPr>
-              <w:t>KẾT LUẬN .......................................................................................................................</w:t>
+              <w:t>KẾT LUẬN .............................................................................................................</w:t>
             </w:r>
           </w:p>
         </w:tc>
@@ -2339,14 +2342,14 @@
           </w:tcPr>
           <w:p>
             <w:pPr>
-              <w:spacing w:line="360" w:lineRule="exact" w:after="180"/>
+              <w:spacing w:line="400" w:lineRule="exact" w:after="180"/>
               <w:ind w:left="0" w:right="0" w:firstLine="0"/>
               <w:jc w:val="right"/>
             </w:pPr>
             <w:r>
               <w:rPr>
                 <w:b/>
-                <w:sz w:val="24"/>
+                <w:sz w:val="26"/>
               </w:rPr>
               <w:t>23</w:t>
             </w:r>
@@ -2366,16 +2369,16 @@
           </w:tcPr>
           <w:p>
             <w:pPr>
-              <w:spacing w:line="360" w:lineRule="exact" w:after="180"/>
+              <w:spacing w:line="400" w:lineRule="exact" w:after="180"/>
               <w:ind w:left="0" w:right="0" w:firstLine="0"/>
               <w:jc w:val="left"/>
             </w:pPr>
             <w:r>
               <w:rPr>
                 <w:b/>
-                <w:sz w:val="24"/>
+                <w:sz w:val="26"/>
               </w:rPr>
-              <w:t>TÀI LIỆU THAM KHẢO ................................................................................................</w:t>
+              <w:t>TÀI LIỆU THAM KHẢO .....................................................................................</w:t>
             </w:r>
           </w:p>
         </w:tc>
@@ -2391,14 +2394,14 @@
           </w:tcPr>
           <w:p>
             <w:pPr>
-              <w:spacing w:line="360" w:lineRule="exact" w:after="180"/>
+              <w:spacing w:line="400" w:lineRule="exact" w:after="180"/>
               <w:ind w:left="0" w:right="0" w:firstLine="0"/>
               <w:jc w:val="right"/>
             </w:pPr>
             <w:r>
               <w:rPr>
                 <w:b/>
-                <w:sz w:val="24"/>
+                <w:sz w:val="26"/>
               </w:rPr>
               <w:t>24</w:t>
             </w:r>

</xml_diff>